<commit_message>
Regenerate the 54 prediction reports under CV-based model selection
The reports in suppl/*/ml were produced by the previous selection rule, which
ranked candidates by their held-out score. They are regenerated here with the
corrected rule so that the released corpus matches the code in this commit's
parent: selection now reads only training-partition cross-validation, and each
report states the CV selection criterion alongside the held-out metrics.

Everything else is unchanged - same three-model registry, same 6,000-participant
stratified subsample, same seeds, same features, same leakage guard - so the
reports are directly comparable to the previous version.

Discrimination for the four outcomes quoted in the manuscript:
metabolic syndrome KNHANES 0.876 -> 0.879, NHANES 0.873 -> 0.878,
diabetes KNHANES 0.837 -> 0.842, chronic kidney disease KNHANES 0.796 -> 0.801.

Co-Authored-By: Claude Opus 5 <noreply@anthropic.com>
</commit_message>
<xml_diff>
--- a/suppl/KNHANES/ml/AbdominalObesity__prediction_KNHANES.docx
+++ b/suppl/KNHANES/ml/AbdominalObesity__prediction_KNHANES.docx
@@ -305,7 +305,12 @@
         <w:pStyle w:val="Heading1"/>
       </w:pPr>
       <w:r>
-        <w:t>Tuning results — best parameters and CV auROC</w:t>
+        <w:t>Tuning and model selection — training-partition cross-validation</w:t>
+      </w:r>
+    </w:p>
+    <w:p>
+      <w:r>
+        <w:t>Hyperparameter search and between-model selection both use these training-partition cross-validated scores. The selection criterion is CV_combined, the mean of the cross-validated auROC and auPRC. The held-out partition is not consulted at this stage.</w:t>
       </w:r>
     </w:p>
     <w:tbl>
@@ -315,14 +320,16 @@
         <w:tblLook w:firstColumn="1" w:firstRow="1" w:lastColumn="0" w:lastRow="0" w:noHBand="0" w:noVBand="1" w:val="04A0"/>
       </w:tblPr>
       <w:tblGrid>
-        <w:gridCol w:w="2880"/>
-        <w:gridCol w:w="2880"/>
-        <w:gridCol w:w="2880"/>
+        <w:gridCol w:w="1728"/>
+        <w:gridCol w:w="1728"/>
+        <w:gridCol w:w="1728"/>
+        <w:gridCol w:w="1728"/>
+        <w:gridCol w:w="1728"/>
       </w:tblGrid>
       <w:tr>
         <w:tc>
           <w:tcPr>
-            <w:tcW w:type="dxa" w:w="2880"/>
+            <w:tcW w:type="dxa" w:w="1728"/>
           </w:tcPr>
           <w:p>
             <w:r>
@@ -332,7 +339,7 @@
         </w:tc>
         <w:tc>
           <w:tcPr>
-            <w:tcW w:type="dxa" w:w="2880"/>
+            <w:tcW w:type="dxa" w:w="1728"/>
           </w:tcPr>
           <w:p>
             <w:r>
@@ -342,7 +349,27 @@
         </w:tc>
         <w:tc>
           <w:tcPr>
-            <w:tcW w:type="dxa" w:w="2880"/>
+            <w:tcW w:type="dxa" w:w="1728"/>
+          </w:tcPr>
+          <w:p>
+            <w:r>
+              <w:t>CV_auPRC</w:t>
+            </w:r>
+          </w:p>
+        </w:tc>
+        <w:tc>
+          <w:tcPr>
+            <w:tcW w:type="dxa" w:w="1728"/>
+          </w:tcPr>
+          <w:p>
+            <w:r>
+              <w:t>CV_combined</w:t>
+            </w:r>
+          </w:p>
+        </w:tc>
+        <w:tc>
+          <w:tcPr>
+            <w:tcW w:type="dxa" w:w="1728"/>
           </w:tcPr>
           <w:p>
             <w:r>
@@ -354,7 +381,7 @@
       <w:tr>
         <w:tc>
           <w:tcPr>
-            <w:tcW w:type="dxa" w:w="2880"/>
+            <w:tcW w:type="dxa" w:w="1728"/>
           </w:tcPr>
           <w:p>
             <w:r>
@@ -364,7 +391,7 @@
         </w:tc>
         <w:tc>
           <w:tcPr>
-            <w:tcW w:type="dxa" w:w="2880"/>
+            <w:tcW w:type="dxa" w:w="1728"/>
           </w:tcPr>
           <w:p>
             <w:r>
@@ -374,7 +401,27 @@
         </w:tc>
         <w:tc>
           <w:tcPr>
-            <w:tcW w:type="dxa" w:w="2880"/>
+            <w:tcW w:type="dxa" w:w="1728"/>
+          </w:tcPr>
+          <w:p>
+            <w:r>
+              <w:t>0.8067</w:t>
+            </w:r>
+          </w:p>
+        </w:tc>
+        <w:tc>
+          <w:tcPr>
+            <w:tcW w:type="dxa" w:w="1728"/>
+          </w:tcPr>
+          <w:p>
+            <w:r>
+              <w:t>0.8536</w:t>
+            </w:r>
+          </w:p>
+        </w:tc>
+        <w:tc>
+          <w:tcPr>
+            <w:tcW w:type="dxa" w:w="1728"/>
           </w:tcPr>
           <w:p>
             <w:r>
@@ -386,7 +433,7 @@
       <w:tr>
         <w:tc>
           <w:tcPr>
-            <w:tcW w:type="dxa" w:w="2880"/>
+            <w:tcW w:type="dxa" w:w="1728"/>
           </w:tcPr>
           <w:p>
             <w:r>
@@ -396,7 +443,7 @@
         </w:tc>
         <w:tc>
           <w:tcPr>
-            <w:tcW w:type="dxa" w:w="2880"/>
+            <w:tcW w:type="dxa" w:w="1728"/>
           </w:tcPr>
           <w:p>
             <w:r>
@@ -406,7 +453,27 @@
         </w:tc>
         <w:tc>
           <w:tcPr>
-            <w:tcW w:type="dxa" w:w="2880"/>
+            <w:tcW w:type="dxa" w:w="1728"/>
+          </w:tcPr>
+          <w:p>
+            <w:r>
+              <w:t>0.827</w:t>
+            </w:r>
+          </w:p>
+        </w:tc>
+        <w:tc>
+          <w:tcPr>
+            <w:tcW w:type="dxa" w:w="1728"/>
+          </w:tcPr>
+          <w:p>
+            <w:r>
+              <w:t>0.8684</w:t>
+            </w:r>
+          </w:p>
+        </w:tc>
+        <w:tc>
+          <w:tcPr>
+            <w:tcW w:type="dxa" w:w="1728"/>
           </w:tcPr>
           <w:p>
             <w:r>
@@ -418,7 +485,7 @@
       <w:tr>
         <w:tc>
           <w:tcPr>
-            <w:tcW w:type="dxa" w:w="2880"/>
+            <w:tcW w:type="dxa" w:w="1728"/>
           </w:tcPr>
           <w:p>
             <w:r>
@@ -428,7 +495,7 @@
         </w:tc>
         <w:tc>
           <w:tcPr>
-            <w:tcW w:type="dxa" w:w="2880"/>
+            <w:tcW w:type="dxa" w:w="1728"/>
           </w:tcPr>
           <w:p>
             <w:r>
@@ -438,7 +505,27 @@
         </w:tc>
         <w:tc>
           <w:tcPr>
-            <w:tcW w:type="dxa" w:w="2880"/>
+            <w:tcW w:type="dxa" w:w="1728"/>
+          </w:tcPr>
+          <w:p>
+            <w:r>
+              <w:t>0.8335</w:t>
+            </w:r>
+          </w:p>
+        </w:tc>
+        <w:tc>
+          <w:tcPr>
+            <w:tcW w:type="dxa" w:w="1728"/>
+          </w:tcPr>
+          <w:p>
+            <w:r>
+              <w:t>0.8735</w:t>
+            </w:r>
+          </w:p>
+        </w:tc>
+        <w:tc>
+          <w:tcPr>
+            <w:tcW w:type="dxa" w:w="1728"/>
           </w:tcPr>
           <w:p>
             <w:r>
@@ -453,7 +540,12 @@
         <w:pStyle w:val="Heading1"/>
       </w:pPr>
       <w:r>
-        <w:t>Full performance metrics (test set)</w:t>
+        <w:t>Held-out performance metrics</w:t>
+      </w:r>
+    </w:p>
+    <w:p>
+      <w:r>
+        <w:t>Reported for every candidate for transparency; only the model selected by CV_combined above is the prespecified final model. Rows are ordered by the CV selection criterion.</w:t>
       </w:r>
     </w:p>
     <w:tbl>
@@ -463,30 +555,31 @@
         <w:tblLook w:firstColumn="1" w:firstRow="1" w:lastColumn="0" w:lastRow="0" w:noHBand="0" w:noVBand="1" w:val="04A0"/>
       </w:tblPr>
       <w:tblGrid>
-        <w:gridCol w:w="455"/>
-        <w:gridCol w:w="455"/>
-        <w:gridCol w:w="455"/>
-        <w:gridCol w:w="455"/>
-        <w:gridCol w:w="455"/>
-        <w:gridCol w:w="455"/>
-        <w:gridCol w:w="455"/>
-        <w:gridCol w:w="455"/>
-        <w:gridCol w:w="455"/>
-        <w:gridCol w:w="455"/>
-        <w:gridCol w:w="455"/>
-        <w:gridCol w:w="455"/>
-        <w:gridCol w:w="455"/>
-        <w:gridCol w:w="455"/>
-        <w:gridCol w:w="455"/>
-        <w:gridCol w:w="455"/>
-        <w:gridCol w:w="455"/>
-        <w:gridCol w:w="455"/>
-        <w:gridCol w:w="455"/>
+        <w:gridCol w:w="432"/>
+        <w:gridCol w:w="432"/>
+        <w:gridCol w:w="432"/>
+        <w:gridCol w:w="432"/>
+        <w:gridCol w:w="432"/>
+        <w:gridCol w:w="432"/>
+        <w:gridCol w:w="432"/>
+        <w:gridCol w:w="432"/>
+        <w:gridCol w:w="432"/>
+        <w:gridCol w:w="432"/>
+        <w:gridCol w:w="432"/>
+        <w:gridCol w:w="432"/>
+        <w:gridCol w:w="432"/>
+        <w:gridCol w:w="432"/>
+        <w:gridCol w:w="432"/>
+        <w:gridCol w:w="432"/>
+        <w:gridCol w:w="432"/>
+        <w:gridCol w:w="432"/>
+        <w:gridCol w:w="432"/>
+        <w:gridCol w:w="432"/>
       </w:tblGrid>
       <w:tr>
         <w:tc>
           <w:tcPr>
-            <w:tcW w:type="dxa" w:w="455"/>
+            <w:tcW w:type="dxa" w:w="432"/>
           </w:tcPr>
           <w:p>
             <w:r>
@@ -496,7 +589,17 @@
         </w:tc>
         <w:tc>
           <w:tcPr>
-            <w:tcW w:type="dxa" w:w="455"/>
+            <w:tcW w:type="dxa" w:w="432"/>
+          </w:tcPr>
+          <w:p>
+            <w:r>
+              <w:t>CV_combined</w:t>
+            </w:r>
+          </w:p>
+        </w:tc>
+        <w:tc>
+          <w:tcPr>
+            <w:tcW w:type="dxa" w:w="432"/>
           </w:tcPr>
           <w:p>
             <w:r>
@@ -506,7 +609,7 @@
         </w:tc>
         <w:tc>
           <w:tcPr>
-            <w:tcW w:type="dxa" w:w="455"/>
+            <w:tcW w:type="dxa" w:w="432"/>
           </w:tcPr>
           <w:p>
             <w:r>
@@ -516,7 +619,7 @@
         </w:tc>
         <w:tc>
           <w:tcPr>
-            <w:tcW w:type="dxa" w:w="455"/>
+            <w:tcW w:type="dxa" w:w="432"/>
           </w:tcPr>
           <w:p>
             <w:r>
@@ -526,7 +629,7 @@
         </w:tc>
         <w:tc>
           <w:tcPr>
-            <w:tcW w:type="dxa" w:w="455"/>
+            <w:tcW w:type="dxa" w:w="432"/>
           </w:tcPr>
           <w:p>
             <w:r>
@@ -536,7 +639,7 @@
         </w:tc>
         <w:tc>
           <w:tcPr>
-            <w:tcW w:type="dxa" w:w="455"/>
+            <w:tcW w:type="dxa" w:w="432"/>
           </w:tcPr>
           <w:p>
             <w:r>
@@ -546,7 +649,7 @@
         </w:tc>
         <w:tc>
           <w:tcPr>
-            <w:tcW w:type="dxa" w:w="455"/>
+            <w:tcW w:type="dxa" w:w="432"/>
           </w:tcPr>
           <w:p>
             <w:r>
@@ -556,7 +659,7 @@
         </w:tc>
         <w:tc>
           <w:tcPr>
-            <w:tcW w:type="dxa" w:w="455"/>
+            <w:tcW w:type="dxa" w:w="432"/>
           </w:tcPr>
           <w:p>
             <w:r>
@@ -566,7 +669,7 @@
         </w:tc>
         <w:tc>
           <w:tcPr>
-            <w:tcW w:type="dxa" w:w="455"/>
+            <w:tcW w:type="dxa" w:w="432"/>
           </w:tcPr>
           <w:p>
             <w:r>
@@ -576,7 +679,7 @@
         </w:tc>
         <w:tc>
           <w:tcPr>
-            <w:tcW w:type="dxa" w:w="455"/>
+            <w:tcW w:type="dxa" w:w="432"/>
           </w:tcPr>
           <w:p>
             <w:r>
@@ -586,7 +689,7 @@
         </w:tc>
         <w:tc>
           <w:tcPr>
-            <w:tcW w:type="dxa" w:w="455"/>
+            <w:tcW w:type="dxa" w:w="432"/>
           </w:tcPr>
           <w:p>
             <w:r>
@@ -596,7 +699,7 @@
         </w:tc>
         <w:tc>
           <w:tcPr>
-            <w:tcW w:type="dxa" w:w="455"/>
+            <w:tcW w:type="dxa" w:w="432"/>
           </w:tcPr>
           <w:p>
             <w:r>
@@ -606,7 +709,7 @@
         </w:tc>
         <w:tc>
           <w:tcPr>
-            <w:tcW w:type="dxa" w:w="455"/>
+            <w:tcW w:type="dxa" w:w="432"/>
           </w:tcPr>
           <w:p>
             <w:r>
@@ -616,7 +719,7 @@
         </w:tc>
         <w:tc>
           <w:tcPr>
-            <w:tcW w:type="dxa" w:w="455"/>
+            <w:tcW w:type="dxa" w:w="432"/>
           </w:tcPr>
           <w:p>
             <w:r>
@@ -626,7 +729,7 @@
         </w:tc>
         <w:tc>
           <w:tcPr>
-            <w:tcW w:type="dxa" w:w="455"/>
+            <w:tcW w:type="dxa" w:w="432"/>
           </w:tcPr>
           <w:p>
             <w:r>
@@ -636,7 +739,7 @@
         </w:tc>
         <w:tc>
           <w:tcPr>
-            <w:tcW w:type="dxa" w:w="455"/>
+            <w:tcW w:type="dxa" w:w="432"/>
           </w:tcPr>
           <w:p>
             <w:r>
@@ -646,7 +749,7 @@
         </w:tc>
         <w:tc>
           <w:tcPr>
-            <w:tcW w:type="dxa" w:w="455"/>
+            <w:tcW w:type="dxa" w:w="432"/>
           </w:tcPr>
           <w:p>
             <w:r>
@@ -656,7 +759,7 @@
         </w:tc>
         <w:tc>
           <w:tcPr>
-            <w:tcW w:type="dxa" w:w="455"/>
+            <w:tcW w:type="dxa" w:w="432"/>
           </w:tcPr>
           <w:p>
             <w:r>
@@ -666,7 +769,7 @@
         </w:tc>
         <w:tc>
           <w:tcPr>
-            <w:tcW w:type="dxa" w:w="455"/>
+            <w:tcW w:type="dxa" w:w="432"/>
           </w:tcPr>
           <w:p>
             <w:r>
@@ -678,7 +781,209 @@
       <w:tr>
         <w:tc>
           <w:tcPr>
-            <w:tcW w:type="dxa" w:w="455"/>
+            <w:tcW w:type="dxa" w:w="432"/>
+          </w:tcPr>
+          <w:p>
+            <w:r>
+              <w:t>XGBoost</w:t>
+            </w:r>
+          </w:p>
+        </w:tc>
+        <w:tc>
+          <w:tcPr>
+            <w:tcW w:type="dxa" w:w="432"/>
+          </w:tcPr>
+          <w:p>
+            <w:r>
+              <w:t>0.8735</w:t>
+            </w:r>
+          </w:p>
+        </w:tc>
+        <w:tc>
+          <w:tcPr>
+            <w:tcW w:type="dxa" w:w="432"/>
+          </w:tcPr>
+          <w:p>
+            <w:r>
+              <w:t>418</w:t>
+            </w:r>
+          </w:p>
+        </w:tc>
+        <w:tc>
+          <w:tcPr>
+            <w:tcW w:type="dxa" w:w="432"/>
+          </w:tcPr>
+          <w:p>
+            <w:r>
+              <w:t>1098</w:t>
+            </w:r>
+          </w:p>
+        </w:tc>
+        <w:tc>
+          <w:tcPr>
+            <w:tcW w:type="dxa" w:w="432"/>
+          </w:tcPr>
+          <w:p>
+            <w:r>
+              <w:t>123</w:t>
+            </w:r>
+          </w:p>
+        </w:tc>
+        <w:tc>
+          <w:tcPr>
+            <w:tcW w:type="dxa" w:w="432"/>
+          </w:tcPr>
+          <w:p>
+            <w:r>
+              <w:t>161</w:t>
+            </w:r>
+          </w:p>
+        </w:tc>
+        <w:tc>
+          <w:tcPr>
+            <w:tcW w:type="dxa" w:w="432"/>
+          </w:tcPr>
+          <w:p>
+            <w:r>
+              <w:t>0.7219</w:t>
+            </w:r>
+          </w:p>
+        </w:tc>
+        <w:tc>
+          <w:tcPr>
+            <w:tcW w:type="dxa" w:w="432"/>
+          </w:tcPr>
+          <w:p>
+            <w:r>
+              <w:t>0.8993</w:t>
+            </w:r>
+          </w:p>
+        </w:tc>
+        <w:tc>
+          <w:tcPr>
+            <w:tcW w:type="dxa" w:w="432"/>
+          </w:tcPr>
+          <w:p>
+            <w:r>
+              <w:t>0.7726</w:t>
+            </w:r>
+          </w:p>
+        </w:tc>
+        <w:tc>
+          <w:tcPr>
+            <w:tcW w:type="dxa" w:w="432"/>
+          </w:tcPr>
+          <w:p>
+            <w:r>
+              <w:t>0.8721</w:t>
+            </w:r>
+          </w:p>
+        </w:tc>
+        <w:tc>
+          <w:tcPr>
+            <w:tcW w:type="dxa" w:w="432"/>
+          </w:tcPr>
+          <w:p>
+            <w:r>
+              <w:t>0.8422</w:t>
+            </w:r>
+          </w:p>
+        </w:tc>
+        <w:tc>
+          <w:tcPr>
+            <w:tcW w:type="dxa" w:w="432"/>
+          </w:tcPr>
+          <w:p>
+            <w:r>
+              <w:t>0.8106</w:t>
+            </w:r>
+          </w:p>
+        </w:tc>
+        <w:tc>
+          <w:tcPr>
+            <w:tcW w:type="dxa" w:w="432"/>
+          </w:tcPr>
+          <w:p>
+            <w:r>
+              <w:t>0.7464</w:t>
+            </w:r>
+          </w:p>
+        </w:tc>
+        <w:tc>
+          <w:tcPr>
+            <w:tcW w:type="dxa" w:w="432"/>
+          </w:tcPr>
+          <w:p>
+            <w:r>
+              <w:t>0.6329</w:t>
+            </w:r>
+          </w:p>
+        </w:tc>
+        <w:tc>
+          <w:tcPr>
+            <w:tcW w:type="dxa" w:w="432"/>
+          </w:tcPr>
+          <w:p>
+            <w:r>
+              <w:t>0.6321</w:t>
+            </w:r>
+          </w:p>
+        </w:tc>
+        <w:tc>
+          <w:tcPr>
+            <w:tcW w:type="dxa" w:w="432"/>
+          </w:tcPr>
+          <w:p>
+            <w:r>
+              <w:t>0.9191</w:t>
+            </w:r>
+          </w:p>
+        </w:tc>
+        <w:tc>
+          <w:tcPr>
+            <w:tcW w:type="dxa" w:w="432"/>
+          </w:tcPr>
+          <w:p>
+            <w:r>
+              <w:t>0.849</w:t>
+            </w:r>
+          </w:p>
+        </w:tc>
+        <w:tc>
+          <w:tcPr>
+            <w:tcW w:type="dxa" w:w="432"/>
+          </w:tcPr>
+          <w:p>
+            <w:r>
+              <w:t>0.3328</w:t>
+            </w:r>
+          </w:p>
+        </w:tc>
+        <w:tc>
+          <w:tcPr>
+            <w:tcW w:type="dxa" w:w="432"/>
+          </w:tcPr>
+          <w:p>
+            <w:r>
+              <w:t>0.1069</w:t>
+            </w:r>
+          </w:p>
+        </w:tc>
+        <w:tc>
+          <w:tcPr>
+            <w:tcW w:type="dxa" w:w="432"/>
+          </w:tcPr>
+          <w:p>
+            <w:r>
+              <w:t>0.8841</w:t>
+            </w:r>
+          </w:p>
+        </w:tc>
+      </w:tr>
+      <w:tr>
+        <w:tc>
+          <w:tcPr>
+            <w:tcW w:type="dxa" w:w="432"/>
           </w:tcPr>
           <w:p>
             <w:r>
@@ -688,7 +993,17 @@
         </w:tc>
         <w:tc>
           <w:tcPr>
-            <w:tcW w:type="dxa" w:w="455"/>
+            <w:tcW w:type="dxa" w:w="432"/>
+          </w:tcPr>
+          <w:p>
+            <w:r>
+              <w:t>0.8684</w:t>
+            </w:r>
+          </w:p>
+        </w:tc>
+        <w:tc>
+          <w:tcPr>
+            <w:tcW w:type="dxa" w:w="432"/>
           </w:tcPr>
           <w:p>
             <w:r>
@@ -698,7 +1013,7 @@
         </w:tc>
         <w:tc>
           <w:tcPr>
-            <w:tcW w:type="dxa" w:w="455"/>
+            <w:tcW w:type="dxa" w:w="432"/>
           </w:tcPr>
           <w:p>
             <w:r>
@@ -708,7 +1023,7 @@
         </w:tc>
         <w:tc>
           <w:tcPr>
-            <w:tcW w:type="dxa" w:w="455"/>
+            <w:tcW w:type="dxa" w:w="432"/>
           </w:tcPr>
           <w:p>
             <w:r>
@@ -718,7 +1033,7 @@
         </w:tc>
         <w:tc>
           <w:tcPr>
-            <w:tcW w:type="dxa" w:w="455"/>
+            <w:tcW w:type="dxa" w:w="432"/>
           </w:tcPr>
           <w:p>
             <w:r>
@@ -728,7 +1043,7 @@
         </w:tc>
         <w:tc>
           <w:tcPr>
-            <w:tcW w:type="dxa" w:w="455"/>
+            <w:tcW w:type="dxa" w:w="432"/>
           </w:tcPr>
           <w:p>
             <w:r>
@@ -738,7 +1053,7 @@
         </w:tc>
         <w:tc>
           <w:tcPr>
-            <w:tcW w:type="dxa" w:w="455"/>
+            <w:tcW w:type="dxa" w:w="432"/>
           </w:tcPr>
           <w:p>
             <w:r>
@@ -748,7 +1063,7 @@
         </w:tc>
         <w:tc>
           <w:tcPr>
-            <w:tcW w:type="dxa" w:w="455"/>
+            <w:tcW w:type="dxa" w:w="432"/>
           </w:tcPr>
           <w:p>
             <w:r>
@@ -758,7 +1073,7 @@
         </w:tc>
         <w:tc>
           <w:tcPr>
-            <w:tcW w:type="dxa" w:w="455"/>
+            <w:tcW w:type="dxa" w:w="432"/>
           </w:tcPr>
           <w:p>
             <w:r>
@@ -768,7 +1083,7 @@
         </w:tc>
         <w:tc>
           <w:tcPr>
-            <w:tcW w:type="dxa" w:w="455"/>
+            <w:tcW w:type="dxa" w:w="432"/>
           </w:tcPr>
           <w:p>
             <w:r>
@@ -778,7 +1093,7 @@
         </w:tc>
         <w:tc>
           <w:tcPr>
-            <w:tcW w:type="dxa" w:w="455"/>
+            <w:tcW w:type="dxa" w:w="432"/>
           </w:tcPr>
           <w:p>
             <w:r>
@@ -788,7 +1103,7 @@
         </w:tc>
         <w:tc>
           <w:tcPr>
-            <w:tcW w:type="dxa" w:w="455"/>
+            <w:tcW w:type="dxa" w:w="432"/>
           </w:tcPr>
           <w:p>
             <w:r>
@@ -798,7 +1113,7 @@
         </w:tc>
         <w:tc>
           <w:tcPr>
-            <w:tcW w:type="dxa" w:w="455"/>
+            <w:tcW w:type="dxa" w:w="432"/>
           </w:tcPr>
           <w:p>
             <w:r>
@@ -808,7 +1123,7 @@
         </w:tc>
         <w:tc>
           <w:tcPr>
-            <w:tcW w:type="dxa" w:w="455"/>
+            <w:tcW w:type="dxa" w:w="432"/>
           </w:tcPr>
           <w:p>
             <w:r>
@@ -818,7 +1133,7 @@
         </w:tc>
         <w:tc>
           <w:tcPr>
-            <w:tcW w:type="dxa" w:w="455"/>
+            <w:tcW w:type="dxa" w:w="432"/>
           </w:tcPr>
           <w:p>
             <w:r>
@@ -828,7 +1143,7 @@
         </w:tc>
         <w:tc>
           <w:tcPr>
-            <w:tcW w:type="dxa" w:w="455"/>
+            <w:tcW w:type="dxa" w:w="432"/>
           </w:tcPr>
           <w:p>
             <w:r>
@@ -838,7 +1153,7 @@
         </w:tc>
         <w:tc>
           <w:tcPr>
-            <w:tcW w:type="dxa" w:w="455"/>
+            <w:tcW w:type="dxa" w:w="432"/>
           </w:tcPr>
           <w:p>
             <w:r>
@@ -848,7 +1163,7 @@
         </w:tc>
         <w:tc>
           <w:tcPr>
-            <w:tcW w:type="dxa" w:w="455"/>
+            <w:tcW w:type="dxa" w:w="432"/>
           </w:tcPr>
           <w:p>
             <w:r>
@@ -858,7 +1173,7 @@
         </w:tc>
         <w:tc>
           <w:tcPr>
-            <w:tcW w:type="dxa" w:w="455"/>
+            <w:tcW w:type="dxa" w:w="432"/>
           </w:tcPr>
           <w:p>
             <w:r>
@@ -870,199 +1185,7 @@
       <w:tr>
         <w:tc>
           <w:tcPr>
-            <w:tcW w:type="dxa" w:w="455"/>
-          </w:tcPr>
-          <w:p>
-            <w:r>
-              <w:t>XGBoost</w:t>
-            </w:r>
-          </w:p>
-        </w:tc>
-        <w:tc>
-          <w:tcPr>
-            <w:tcW w:type="dxa" w:w="455"/>
-          </w:tcPr>
-          <w:p>
-            <w:r>
-              <w:t>418</w:t>
-            </w:r>
-          </w:p>
-        </w:tc>
-        <w:tc>
-          <w:tcPr>
-            <w:tcW w:type="dxa" w:w="455"/>
-          </w:tcPr>
-          <w:p>
-            <w:r>
-              <w:t>1098</w:t>
-            </w:r>
-          </w:p>
-        </w:tc>
-        <w:tc>
-          <w:tcPr>
-            <w:tcW w:type="dxa" w:w="455"/>
-          </w:tcPr>
-          <w:p>
-            <w:r>
-              <w:t>123</w:t>
-            </w:r>
-          </w:p>
-        </w:tc>
-        <w:tc>
-          <w:tcPr>
-            <w:tcW w:type="dxa" w:w="455"/>
-          </w:tcPr>
-          <w:p>
-            <w:r>
-              <w:t>161</w:t>
-            </w:r>
-          </w:p>
-        </w:tc>
-        <w:tc>
-          <w:tcPr>
-            <w:tcW w:type="dxa" w:w="455"/>
-          </w:tcPr>
-          <w:p>
-            <w:r>
-              <w:t>0.7219</w:t>
-            </w:r>
-          </w:p>
-        </w:tc>
-        <w:tc>
-          <w:tcPr>
-            <w:tcW w:type="dxa" w:w="455"/>
-          </w:tcPr>
-          <w:p>
-            <w:r>
-              <w:t>0.8993</w:t>
-            </w:r>
-          </w:p>
-        </w:tc>
-        <w:tc>
-          <w:tcPr>
-            <w:tcW w:type="dxa" w:w="455"/>
-          </w:tcPr>
-          <w:p>
-            <w:r>
-              <w:t>0.7726</w:t>
-            </w:r>
-          </w:p>
-        </w:tc>
-        <w:tc>
-          <w:tcPr>
-            <w:tcW w:type="dxa" w:w="455"/>
-          </w:tcPr>
-          <w:p>
-            <w:r>
-              <w:t>0.8721</w:t>
-            </w:r>
-          </w:p>
-        </w:tc>
-        <w:tc>
-          <w:tcPr>
-            <w:tcW w:type="dxa" w:w="455"/>
-          </w:tcPr>
-          <w:p>
-            <w:r>
-              <w:t>0.8422</w:t>
-            </w:r>
-          </w:p>
-        </w:tc>
-        <w:tc>
-          <w:tcPr>
-            <w:tcW w:type="dxa" w:w="455"/>
-          </w:tcPr>
-          <w:p>
-            <w:r>
-              <w:t>0.8106</w:t>
-            </w:r>
-          </w:p>
-        </w:tc>
-        <w:tc>
-          <w:tcPr>
-            <w:tcW w:type="dxa" w:w="455"/>
-          </w:tcPr>
-          <w:p>
-            <w:r>
-              <w:t>0.7464</w:t>
-            </w:r>
-          </w:p>
-        </w:tc>
-        <w:tc>
-          <w:tcPr>
-            <w:tcW w:type="dxa" w:w="455"/>
-          </w:tcPr>
-          <w:p>
-            <w:r>
-              <w:t>0.6329</w:t>
-            </w:r>
-          </w:p>
-        </w:tc>
-        <w:tc>
-          <w:tcPr>
-            <w:tcW w:type="dxa" w:w="455"/>
-          </w:tcPr>
-          <w:p>
-            <w:r>
-              <w:t>0.6321</w:t>
-            </w:r>
-          </w:p>
-        </w:tc>
-        <w:tc>
-          <w:tcPr>
-            <w:tcW w:type="dxa" w:w="455"/>
-          </w:tcPr>
-          <w:p>
-            <w:r>
-              <w:t>0.9191</w:t>
-            </w:r>
-          </w:p>
-        </w:tc>
-        <w:tc>
-          <w:tcPr>
-            <w:tcW w:type="dxa" w:w="455"/>
-          </w:tcPr>
-          <w:p>
-            <w:r>
-              <w:t>0.849</w:t>
-            </w:r>
-          </w:p>
-        </w:tc>
-        <w:tc>
-          <w:tcPr>
-            <w:tcW w:type="dxa" w:w="455"/>
-          </w:tcPr>
-          <w:p>
-            <w:r>
-              <w:t>0.3328</w:t>
-            </w:r>
-          </w:p>
-        </w:tc>
-        <w:tc>
-          <w:tcPr>
-            <w:tcW w:type="dxa" w:w="455"/>
-          </w:tcPr>
-          <w:p>
-            <w:r>
-              <w:t>0.1069</w:t>
-            </w:r>
-          </w:p>
-        </w:tc>
-        <w:tc>
-          <w:tcPr>
-            <w:tcW w:type="dxa" w:w="455"/>
-          </w:tcPr>
-          <w:p>
-            <w:r>
-              <w:t>0.8841</w:t>
-            </w:r>
-          </w:p>
-        </w:tc>
-      </w:tr>
-      <w:tr>
-        <w:tc>
-          <w:tcPr>
-            <w:tcW w:type="dxa" w:w="455"/>
+            <w:tcW w:type="dxa" w:w="432"/>
           </w:tcPr>
           <w:p>
             <w:r>
@@ -1072,7 +1195,17 @@
         </w:tc>
         <w:tc>
           <w:tcPr>
-            <w:tcW w:type="dxa" w:w="455"/>
+            <w:tcW w:type="dxa" w:w="432"/>
+          </w:tcPr>
+          <w:p>
+            <w:r>
+              <w:t>0.8536</w:t>
+            </w:r>
+          </w:p>
+        </w:tc>
+        <w:tc>
+          <w:tcPr>
+            <w:tcW w:type="dxa" w:w="432"/>
           </w:tcPr>
           <w:p>
             <w:r>
@@ -1082,7 +1215,7 @@
         </w:tc>
         <w:tc>
           <w:tcPr>
-            <w:tcW w:type="dxa" w:w="455"/>
+            <w:tcW w:type="dxa" w:w="432"/>
           </w:tcPr>
           <w:p>
             <w:r>
@@ -1092,7 +1225,7 @@
         </w:tc>
         <w:tc>
           <w:tcPr>
-            <w:tcW w:type="dxa" w:w="455"/>
+            <w:tcW w:type="dxa" w:w="432"/>
           </w:tcPr>
           <w:p>
             <w:r>
@@ -1102,7 +1235,7 @@
         </w:tc>
         <w:tc>
           <w:tcPr>
-            <w:tcW w:type="dxa" w:w="455"/>
+            <w:tcW w:type="dxa" w:w="432"/>
           </w:tcPr>
           <w:p>
             <w:r>
@@ -1112,7 +1245,7 @@
         </w:tc>
         <w:tc>
           <w:tcPr>
-            <w:tcW w:type="dxa" w:w="455"/>
+            <w:tcW w:type="dxa" w:w="432"/>
           </w:tcPr>
           <w:p>
             <w:r>
@@ -1122,7 +1255,7 @@
         </w:tc>
         <w:tc>
           <w:tcPr>
-            <w:tcW w:type="dxa" w:w="455"/>
+            <w:tcW w:type="dxa" w:w="432"/>
           </w:tcPr>
           <w:p>
             <w:r>
@@ -1132,7 +1265,7 @@
         </w:tc>
         <w:tc>
           <w:tcPr>
-            <w:tcW w:type="dxa" w:w="455"/>
+            <w:tcW w:type="dxa" w:w="432"/>
           </w:tcPr>
           <w:p>
             <w:r>
@@ -1142,7 +1275,7 @@
         </w:tc>
         <w:tc>
           <w:tcPr>
-            <w:tcW w:type="dxa" w:w="455"/>
+            <w:tcW w:type="dxa" w:w="432"/>
           </w:tcPr>
           <w:p>
             <w:r>
@@ -1152,7 +1285,7 @@
         </w:tc>
         <w:tc>
           <w:tcPr>
-            <w:tcW w:type="dxa" w:w="455"/>
+            <w:tcW w:type="dxa" w:w="432"/>
           </w:tcPr>
           <w:p>
             <w:r>
@@ -1162,7 +1295,7 @@
         </w:tc>
         <w:tc>
           <w:tcPr>
-            <w:tcW w:type="dxa" w:w="455"/>
+            <w:tcW w:type="dxa" w:w="432"/>
           </w:tcPr>
           <w:p>
             <w:r>
@@ -1172,7 +1305,7 @@
         </w:tc>
         <w:tc>
           <w:tcPr>
-            <w:tcW w:type="dxa" w:w="455"/>
+            <w:tcW w:type="dxa" w:w="432"/>
           </w:tcPr>
           <w:p>
             <w:r>
@@ -1182,7 +1315,7 @@
         </w:tc>
         <w:tc>
           <w:tcPr>
-            <w:tcW w:type="dxa" w:w="455"/>
+            <w:tcW w:type="dxa" w:w="432"/>
           </w:tcPr>
           <w:p>
             <w:r>
@@ -1192,7 +1325,7 @@
         </w:tc>
         <w:tc>
           <w:tcPr>
-            <w:tcW w:type="dxa" w:w="455"/>
+            <w:tcW w:type="dxa" w:w="432"/>
           </w:tcPr>
           <w:p>
             <w:r>
@@ -1202,7 +1335,7 @@
         </w:tc>
         <w:tc>
           <w:tcPr>
-            <w:tcW w:type="dxa" w:w="455"/>
+            <w:tcW w:type="dxa" w:w="432"/>
           </w:tcPr>
           <w:p>
             <w:r>
@@ -1212,7 +1345,7 @@
         </w:tc>
         <w:tc>
           <w:tcPr>
-            <w:tcW w:type="dxa" w:w="455"/>
+            <w:tcW w:type="dxa" w:w="432"/>
           </w:tcPr>
           <w:p>
             <w:r>
@@ -1222,7 +1355,7 @@
         </w:tc>
         <w:tc>
           <w:tcPr>
-            <w:tcW w:type="dxa" w:w="455"/>
+            <w:tcW w:type="dxa" w:w="432"/>
           </w:tcPr>
           <w:p>
             <w:r>
@@ -1232,7 +1365,7 @@
         </w:tc>
         <w:tc>
           <w:tcPr>
-            <w:tcW w:type="dxa" w:w="455"/>
+            <w:tcW w:type="dxa" w:w="432"/>
           </w:tcPr>
           <w:p>
             <w:r>
@@ -1242,7 +1375,7 @@
         </w:tc>
         <w:tc>
           <w:tcPr>
-            <w:tcW w:type="dxa" w:w="455"/>
+            <w:tcW w:type="dxa" w:w="432"/>
           </w:tcPr>
           <w:p>
             <w:r>
@@ -1301,12 +1434,12 @@
         <w:pStyle w:val="Heading1"/>
       </w:pPr>
       <w:r>
-        <w:t>Selected final model — HistGradientBoosting (combined=0.8844)</w:t>
+        <w:t>Selected final model — XGBoost (CV combined=0.8735; held-out auROC=0.9191)</w:t>
       </w:r>
     </w:p>
     <w:p>
       <w:r>
-        <w:t>Among 3 candidate models, HistGradientBoosting achieved the highest combined score, with an area under the receiver operating characteristic curve of 0.9196 and area under the precision-recall curve of 0.8492.</w:t>
+        <w:t>Among 3 candidate models, XGBoost achieved the highest cross-validated combined score (0.8735) within the training partition and was selected on that basis. Refitted on the complete training partition and evaluated once on the untouched held-out partition, it reached an area under the receiver operating characteristic curve of 0.9191 and an area under the precision-recall curve of 0.849.</w:t>
       </w:r>
     </w:p>
     <w:p>
@@ -1475,7 +1608,7 @@
           </w:tcPr>
           <w:p>
             <w:r>
-              <w:t>721.0</w:t>
+              <w:t>728.0</w:t>
             </w:r>
           </w:p>
         </w:tc>
@@ -1485,7 +1618,7 @@
           </w:tcPr>
           <w:p>
             <w:r>
-              <w:t>500.0</w:t>
+              <w:t>493.0</w:t>
             </w:r>
           </w:p>
         </w:tc>
@@ -1515,7 +1648,7 @@
           </w:tcPr>
           <w:p>
             <w:r>
-              <w:t>0.59</w:t>
+              <w:t>0.596</w:t>
             </w:r>
           </w:p>
         </w:tc>
@@ -1525,7 +1658,7 @@
           </w:tcPr>
           <w:p>
             <w:r>
-              <w:t>0.53</w:t>
+              <w:t>0.533</w:t>
             </w:r>
           </w:p>
         </w:tc>
@@ -1545,7 +1678,7 @@
           </w:tcPr>
           <w:p>
             <w:r>
-              <w:t>0.686</w:t>
+              <w:t>0.689</w:t>
             </w:r>
           </w:p>
         </w:tc>
@@ -1555,7 +1688,7 @@
           </w:tcPr>
           <w:p>
             <w:r>
-              <w:t>0.713</w:t>
+              <w:t>0.717</w:t>
             </w:r>
           </w:p>
         </w:tc>
@@ -1577,7 +1710,7 @@
           </w:tcPr>
           <w:p>
             <w:r>
-              <w:t>542.0</w:t>
+              <w:t>539.0</w:t>
             </w:r>
           </w:p>
         </w:tc>
@@ -1587,7 +1720,7 @@
           </w:tcPr>
           <w:p>
             <w:r>
-              <w:t>869.0</w:t>
+              <w:t>856.0</w:t>
             </w:r>
           </w:p>
         </w:tc>
@@ -1597,7 +1730,7 @@
           </w:tcPr>
           <w:p>
             <w:r>
-              <w:t>352.0</w:t>
+              <w:t>365.0</w:t>
             </w:r>
           </w:p>
         </w:tc>
@@ -1607,7 +1740,7 @@
           </w:tcPr>
           <w:p>
             <w:r>
-              <w:t>37.0</w:t>
+              <w:t>40.0</w:t>
             </w:r>
           </w:p>
         </w:tc>
@@ -1617,7 +1750,7 @@
           </w:tcPr>
           <w:p>
             <w:r>
-              <w:t>0.936</w:t>
+              <w:t>0.931</w:t>
             </w:r>
           </w:p>
         </w:tc>
@@ -1627,7 +1760,7 @@
           </w:tcPr>
           <w:p>
             <w:r>
-              <w:t>0.712</w:t>
+              <w:t>0.701</w:t>
             </w:r>
           </w:p>
         </w:tc>
@@ -1637,7 +1770,7 @@
           </w:tcPr>
           <w:p>
             <w:r>
-              <w:t>0.606</w:t>
+              <w:t>0.596</w:t>
             </w:r>
           </w:p>
         </w:tc>
@@ -1647,7 +1780,7 @@
           </w:tcPr>
           <w:p>
             <w:r>
-              <w:t>0.959</w:t>
+              <w:t>0.955</w:t>
             </w:r>
           </w:p>
         </w:tc>
@@ -1657,7 +1790,7 @@
           </w:tcPr>
           <w:p>
             <w:r>
-              <w:t>0.736</w:t>
+              <w:t>0.727</w:t>
             </w:r>
           </w:p>
         </w:tc>
@@ -1667,7 +1800,7 @@
           </w:tcPr>
           <w:p>
             <w:r>
-              <w:t>0.784</w:t>
+              <w:t>0.775</w:t>
             </w:r>
           </w:p>
         </w:tc>
@@ -1689,7 +1822,7 @@
           </w:tcPr>
           <w:p>
             <w:r>
-              <w:t>515.0</w:t>
+              <w:t>516.0</w:t>
             </w:r>
           </w:p>
         </w:tc>
@@ -1699,7 +1832,7 @@
           </w:tcPr>
           <w:p>
             <w:r>
-              <w:t>953.0</w:t>
+              <w:t>954.0</w:t>
             </w:r>
           </w:p>
         </w:tc>
@@ -1709,7 +1842,7 @@
           </w:tcPr>
           <w:p>
             <w:r>
-              <w:t>268.0</w:t>
+              <w:t>267.0</w:t>
             </w:r>
           </w:p>
         </w:tc>
@@ -1719,7 +1852,7 @@
           </w:tcPr>
           <w:p>
             <w:r>
-              <w:t>64.0</w:t>
+              <w:t>63.0</w:t>
             </w:r>
           </w:p>
         </w:tc>
@@ -1729,7 +1862,7 @@
           </w:tcPr>
           <w:p>
             <w:r>
-              <w:t>0.889</w:t>
+              <w:t>0.891</w:t>
             </w:r>
           </w:p>
         </w:tc>
@@ -1749,7 +1882,7 @@
           </w:tcPr>
           <w:p>
             <w:r>
-              <w:t>0.658</w:t>
+              <w:t>0.659</w:t>
             </w:r>
           </w:p>
         </w:tc>
@@ -1759,7 +1892,7 @@
           </w:tcPr>
           <w:p>
             <w:r>
-              <w:t>0.937</w:t>
+              <w:t>0.938</w:t>
             </w:r>
           </w:p>
         </w:tc>
@@ -1769,7 +1902,7 @@
           </w:tcPr>
           <w:p>
             <w:r>
-              <w:t>0.756</w:t>
+              <w:t>0.758</w:t>
             </w:r>
           </w:p>
         </w:tc>
@@ -1779,7 +1912,7 @@
           </w:tcPr>
           <w:p>
             <w:r>
-              <w:t>0.816</w:t>
+              <w:t>0.817</w:t>
             </w:r>
           </w:p>
         </w:tc>
@@ -1801,7 +1934,7 @@
           </w:tcPr>
           <w:p>
             <w:r>
-              <w:t>466.0</w:t>
+              <w:t>474.0</w:t>
             </w:r>
           </w:p>
         </w:tc>
@@ -1831,7 +1964,7 @@
           </w:tcPr>
           <w:p>
             <w:r>
-              <w:t>113.0</w:t>
+              <w:t>105.0</w:t>
             </w:r>
           </w:p>
         </w:tc>
@@ -1841,7 +1974,7 @@
           </w:tcPr>
           <w:p>
             <w:r>
-              <w:t>0.805</w:t>
+              <w:t>0.819</w:t>
             </w:r>
           </w:p>
         </w:tc>
@@ -1861,7 +1994,7 @@
           </w:tcPr>
           <w:p>
             <w:r>
-              <w:t>0.706</w:t>
+              <w:t>0.71</w:t>
             </w:r>
           </w:p>
         </w:tc>
@@ -1871,7 +2004,7 @@
           </w:tcPr>
           <w:p>
             <w:r>
-              <w:t>0.901</w:t>
+              <w:t>0.907</w:t>
             </w:r>
           </w:p>
         </w:tc>
@@ -1881,7 +2014,343 @@
           </w:tcPr>
           <w:p>
             <w:r>
-              <w:t>0.752</w:t>
+              <w:t>0.76</w:t>
+            </w:r>
+          </w:p>
+        </w:tc>
+        <w:tc>
+          <w:tcPr>
+            <w:tcW w:type="dxa" w:w="785"/>
+          </w:tcPr>
+          <w:p>
+            <w:r>
+              <w:t>0.834</w:t>
+            </w:r>
+          </w:p>
+        </w:tc>
+      </w:tr>
+      <w:tr>
+        <w:tc>
+          <w:tcPr>
+            <w:tcW w:type="dxa" w:w="785"/>
+          </w:tcPr>
+          <w:p>
+            <w:r>
+              <w:t>0.5</w:t>
+            </w:r>
+          </w:p>
+        </w:tc>
+        <w:tc>
+          <w:tcPr>
+            <w:tcW w:type="dxa" w:w="785"/>
+          </w:tcPr>
+          <w:p>
+            <w:r>
+              <w:t>418.0</w:t>
+            </w:r>
+          </w:p>
+        </w:tc>
+        <w:tc>
+          <w:tcPr>
+            <w:tcW w:type="dxa" w:w="785"/>
+          </w:tcPr>
+          <w:p>
+            <w:r>
+              <w:t>1098.0</w:t>
+            </w:r>
+          </w:p>
+        </w:tc>
+        <w:tc>
+          <w:tcPr>
+            <w:tcW w:type="dxa" w:w="785"/>
+          </w:tcPr>
+          <w:p>
+            <w:r>
+              <w:t>123.0</w:t>
+            </w:r>
+          </w:p>
+        </w:tc>
+        <w:tc>
+          <w:tcPr>
+            <w:tcW w:type="dxa" w:w="785"/>
+          </w:tcPr>
+          <w:p>
+            <w:r>
+              <w:t>161.0</w:t>
+            </w:r>
+          </w:p>
+        </w:tc>
+        <w:tc>
+          <w:tcPr>
+            <w:tcW w:type="dxa" w:w="785"/>
+          </w:tcPr>
+          <w:p>
+            <w:r>
+              <w:t>0.722</w:t>
+            </w:r>
+          </w:p>
+        </w:tc>
+        <w:tc>
+          <w:tcPr>
+            <w:tcW w:type="dxa" w:w="785"/>
+          </w:tcPr>
+          <w:p>
+            <w:r>
+              <w:t>0.899</w:t>
+            </w:r>
+          </w:p>
+        </w:tc>
+        <w:tc>
+          <w:tcPr>
+            <w:tcW w:type="dxa" w:w="785"/>
+          </w:tcPr>
+          <w:p>
+            <w:r>
+              <w:t>0.773</w:t>
+            </w:r>
+          </w:p>
+        </w:tc>
+        <w:tc>
+          <w:tcPr>
+            <w:tcW w:type="dxa" w:w="785"/>
+          </w:tcPr>
+          <w:p>
+            <w:r>
+              <w:t>0.872</w:t>
+            </w:r>
+          </w:p>
+        </w:tc>
+        <w:tc>
+          <w:tcPr>
+            <w:tcW w:type="dxa" w:w="785"/>
+          </w:tcPr>
+          <w:p>
+            <w:r>
+              <w:t>0.746</w:t>
+            </w:r>
+          </w:p>
+        </w:tc>
+        <w:tc>
+          <w:tcPr>
+            <w:tcW w:type="dxa" w:w="785"/>
+          </w:tcPr>
+          <w:p>
+            <w:r>
+              <w:t>0.842</w:t>
+            </w:r>
+          </w:p>
+        </w:tc>
+      </w:tr>
+      <w:tr>
+        <w:tc>
+          <w:tcPr>
+            <w:tcW w:type="dxa" w:w="785"/>
+          </w:tcPr>
+          <w:p>
+            <w:r>
+              <w:t>0.6</w:t>
+            </w:r>
+          </w:p>
+        </w:tc>
+        <w:tc>
+          <w:tcPr>
+            <w:tcW w:type="dxa" w:w="785"/>
+          </w:tcPr>
+          <w:p>
+            <w:r>
+              <w:t>362.0</w:t>
+            </w:r>
+          </w:p>
+        </w:tc>
+        <w:tc>
+          <w:tcPr>
+            <w:tcW w:type="dxa" w:w="785"/>
+          </w:tcPr>
+          <w:p>
+            <w:r>
+              <w:t>1145.0</w:t>
+            </w:r>
+          </w:p>
+        </w:tc>
+        <w:tc>
+          <w:tcPr>
+            <w:tcW w:type="dxa" w:w="785"/>
+          </w:tcPr>
+          <w:p>
+            <w:r>
+              <w:t>76.0</w:t>
+            </w:r>
+          </w:p>
+        </w:tc>
+        <w:tc>
+          <w:tcPr>
+            <w:tcW w:type="dxa" w:w="785"/>
+          </w:tcPr>
+          <w:p>
+            <w:r>
+              <w:t>217.0</w:t>
+            </w:r>
+          </w:p>
+        </w:tc>
+        <w:tc>
+          <w:tcPr>
+            <w:tcW w:type="dxa" w:w="785"/>
+          </w:tcPr>
+          <w:p>
+            <w:r>
+              <w:t>0.625</w:t>
+            </w:r>
+          </w:p>
+        </w:tc>
+        <w:tc>
+          <w:tcPr>
+            <w:tcW w:type="dxa" w:w="785"/>
+          </w:tcPr>
+          <w:p>
+            <w:r>
+              <w:t>0.938</w:t>
+            </w:r>
+          </w:p>
+        </w:tc>
+        <w:tc>
+          <w:tcPr>
+            <w:tcW w:type="dxa" w:w="785"/>
+          </w:tcPr>
+          <w:p>
+            <w:r>
+              <w:t>0.826</w:t>
+            </w:r>
+          </w:p>
+        </w:tc>
+        <w:tc>
+          <w:tcPr>
+            <w:tcW w:type="dxa" w:w="785"/>
+          </w:tcPr>
+          <w:p>
+            <w:r>
+              <w:t>0.841</w:t>
+            </w:r>
+          </w:p>
+        </w:tc>
+        <w:tc>
+          <w:tcPr>
+            <w:tcW w:type="dxa" w:w="785"/>
+          </w:tcPr>
+          <w:p>
+            <w:r>
+              <w:t>0.712</w:t>
+            </w:r>
+          </w:p>
+        </w:tc>
+        <w:tc>
+          <w:tcPr>
+            <w:tcW w:type="dxa" w:w="785"/>
+          </w:tcPr>
+          <w:p>
+            <w:r>
+              <w:t>0.837</w:t>
+            </w:r>
+          </w:p>
+        </w:tc>
+      </w:tr>
+      <w:tr>
+        <w:tc>
+          <w:tcPr>
+            <w:tcW w:type="dxa" w:w="785"/>
+          </w:tcPr>
+          <w:p>
+            <w:r>
+              <w:t>0.7</w:t>
+            </w:r>
+          </w:p>
+        </w:tc>
+        <w:tc>
+          <w:tcPr>
+            <w:tcW w:type="dxa" w:w="785"/>
+          </w:tcPr>
+          <w:p>
+            <w:r>
+              <w:t>304.0</w:t>
+            </w:r>
+          </w:p>
+        </w:tc>
+        <w:tc>
+          <w:tcPr>
+            <w:tcW w:type="dxa" w:w="785"/>
+          </w:tcPr>
+          <w:p>
+            <w:r>
+              <w:t>1188.0</w:t>
+            </w:r>
+          </w:p>
+        </w:tc>
+        <w:tc>
+          <w:tcPr>
+            <w:tcW w:type="dxa" w:w="785"/>
+          </w:tcPr>
+          <w:p>
+            <w:r>
+              <w:t>33.0</w:t>
+            </w:r>
+          </w:p>
+        </w:tc>
+        <w:tc>
+          <w:tcPr>
+            <w:tcW w:type="dxa" w:w="785"/>
+          </w:tcPr>
+          <w:p>
+            <w:r>
+              <w:t>275.0</w:t>
+            </w:r>
+          </w:p>
+        </w:tc>
+        <w:tc>
+          <w:tcPr>
+            <w:tcW w:type="dxa" w:w="785"/>
+          </w:tcPr>
+          <w:p>
+            <w:r>
+              <w:t>0.525</w:t>
+            </w:r>
+          </w:p>
+        </w:tc>
+        <w:tc>
+          <w:tcPr>
+            <w:tcW w:type="dxa" w:w="785"/>
+          </w:tcPr>
+          <w:p>
+            <w:r>
+              <w:t>0.973</w:t>
+            </w:r>
+          </w:p>
+        </w:tc>
+        <w:tc>
+          <w:tcPr>
+            <w:tcW w:type="dxa" w:w="785"/>
+          </w:tcPr>
+          <w:p>
+            <w:r>
+              <w:t>0.902</w:t>
+            </w:r>
+          </w:p>
+        </w:tc>
+        <w:tc>
+          <w:tcPr>
+            <w:tcW w:type="dxa" w:w="785"/>
+          </w:tcPr>
+          <w:p>
+            <w:r>
+              <w:t>0.812</w:t>
+            </w:r>
+          </w:p>
+        </w:tc>
+        <w:tc>
+          <w:tcPr>
+            <w:tcW w:type="dxa" w:w="785"/>
+          </w:tcPr>
+          <w:p>
+            <w:r>
+              <w:t>0.664</w:t>
             </w:r>
           </w:p>
         </w:tc>
@@ -1903,342 +2372,6 @@
           </w:tcPr>
           <w:p>
             <w:r>
-              <w:t>0.5</w:t>
-            </w:r>
-          </w:p>
-        </w:tc>
-        <w:tc>
-          <w:tcPr>
-            <w:tcW w:type="dxa" w:w="785"/>
-          </w:tcPr>
-          <w:p>
-            <w:r>
-              <w:t>408.0</w:t>
-            </w:r>
-          </w:p>
-        </w:tc>
-        <w:tc>
-          <w:tcPr>
-            <w:tcW w:type="dxa" w:w="785"/>
-          </w:tcPr>
-          <w:p>
-            <w:r>
-              <w:t>1103.0</w:t>
-            </w:r>
-          </w:p>
-        </w:tc>
-        <w:tc>
-          <w:tcPr>
-            <w:tcW w:type="dxa" w:w="785"/>
-          </w:tcPr>
-          <w:p>
-            <w:r>
-              <w:t>118.0</w:t>
-            </w:r>
-          </w:p>
-        </w:tc>
-        <w:tc>
-          <w:tcPr>
-            <w:tcW w:type="dxa" w:w="785"/>
-          </w:tcPr>
-          <w:p>
-            <w:r>
-              <w:t>171.0</w:t>
-            </w:r>
-          </w:p>
-        </w:tc>
-        <w:tc>
-          <w:tcPr>
-            <w:tcW w:type="dxa" w:w="785"/>
-          </w:tcPr>
-          <w:p>
-            <w:r>
-              <w:t>0.705</w:t>
-            </w:r>
-          </w:p>
-        </w:tc>
-        <w:tc>
-          <w:tcPr>
-            <w:tcW w:type="dxa" w:w="785"/>
-          </w:tcPr>
-          <w:p>
-            <w:r>
-              <w:t>0.903</w:t>
-            </w:r>
-          </w:p>
-        </w:tc>
-        <w:tc>
-          <w:tcPr>
-            <w:tcW w:type="dxa" w:w="785"/>
-          </w:tcPr>
-          <w:p>
-            <w:r>
-              <w:t>0.776</w:t>
-            </w:r>
-          </w:p>
-        </w:tc>
-        <w:tc>
-          <w:tcPr>
-            <w:tcW w:type="dxa" w:w="785"/>
-          </w:tcPr>
-          <w:p>
-            <w:r>
-              <w:t>0.866</w:t>
-            </w:r>
-          </w:p>
-        </w:tc>
-        <w:tc>
-          <w:tcPr>
-            <w:tcW w:type="dxa" w:w="785"/>
-          </w:tcPr>
-          <w:p>
-            <w:r>
-              <w:t>0.738</w:t>
-            </w:r>
-          </w:p>
-        </w:tc>
-        <w:tc>
-          <w:tcPr>
-            <w:tcW w:type="dxa" w:w="785"/>
-          </w:tcPr>
-          <w:p>
-            <w:r>
-              <w:t>0.839</w:t>
-            </w:r>
-          </w:p>
-        </w:tc>
-      </w:tr>
-      <w:tr>
-        <w:tc>
-          <w:tcPr>
-            <w:tcW w:type="dxa" w:w="785"/>
-          </w:tcPr>
-          <w:p>
-            <w:r>
-              <w:t>0.6</w:t>
-            </w:r>
-          </w:p>
-        </w:tc>
-        <w:tc>
-          <w:tcPr>
-            <w:tcW w:type="dxa" w:w="785"/>
-          </w:tcPr>
-          <w:p>
-            <w:r>
-              <w:t>355.0</w:t>
-            </w:r>
-          </w:p>
-        </w:tc>
-        <w:tc>
-          <w:tcPr>
-            <w:tcW w:type="dxa" w:w="785"/>
-          </w:tcPr>
-          <w:p>
-            <w:r>
-              <w:t>1162.0</w:t>
-            </w:r>
-          </w:p>
-        </w:tc>
-        <w:tc>
-          <w:tcPr>
-            <w:tcW w:type="dxa" w:w="785"/>
-          </w:tcPr>
-          <w:p>
-            <w:r>
-              <w:t>59.0</w:t>
-            </w:r>
-          </w:p>
-        </w:tc>
-        <w:tc>
-          <w:tcPr>
-            <w:tcW w:type="dxa" w:w="785"/>
-          </w:tcPr>
-          <w:p>
-            <w:r>
-              <w:t>224.0</w:t>
-            </w:r>
-          </w:p>
-        </w:tc>
-        <w:tc>
-          <w:tcPr>
-            <w:tcW w:type="dxa" w:w="785"/>
-          </w:tcPr>
-          <w:p>
-            <w:r>
-              <w:t>0.613</w:t>
-            </w:r>
-          </w:p>
-        </w:tc>
-        <w:tc>
-          <w:tcPr>
-            <w:tcW w:type="dxa" w:w="785"/>
-          </w:tcPr>
-          <w:p>
-            <w:r>
-              <w:t>0.952</w:t>
-            </w:r>
-          </w:p>
-        </w:tc>
-        <w:tc>
-          <w:tcPr>
-            <w:tcW w:type="dxa" w:w="785"/>
-          </w:tcPr>
-          <w:p>
-            <w:r>
-              <w:t>0.857</w:t>
-            </w:r>
-          </w:p>
-        </w:tc>
-        <w:tc>
-          <w:tcPr>
-            <w:tcW w:type="dxa" w:w="785"/>
-          </w:tcPr>
-          <w:p>
-            <w:r>
-              <w:t>0.838</w:t>
-            </w:r>
-          </w:p>
-        </w:tc>
-        <w:tc>
-          <w:tcPr>
-            <w:tcW w:type="dxa" w:w="785"/>
-          </w:tcPr>
-          <w:p>
-            <w:r>
-              <w:t>0.715</w:t>
-            </w:r>
-          </w:p>
-        </w:tc>
-        <w:tc>
-          <w:tcPr>
-            <w:tcW w:type="dxa" w:w="785"/>
-          </w:tcPr>
-          <w:p>
-            <w:r>
-              <w:t>0.843</w:t>
-            </w:r>
-          </w:p>
-        </w:tc>
-      </w:tr>
-      <w:tr>
-        <w:tc>
-          <w:tcPr>
-            <w:tcW w:type="dxa" w:w="785"/>
-          </w:tcPr>
-          <w:p>
-            <w:r>
-              <w:t>0.7</w:t>
-            </w:r>
-          </w:p>
-        </w:tc>
-        <w:tc>
-          <w:tcPr>
-            <w:tcW w:type="dxa" w:w="785"/>
-          </w:tcPr>
-          <w:p>
-            <w:r>
-              <w:t>290.0</w:t>
-            </w:r>
-          </w:p>
-        </w:tc>
-        <w:tc>
-          <w:tcPr>
-            <w:tcW w:type="dxa" w:w="785"/>
-          </w:tcPr>
-          <w:p>
-            <w:r>
-              <w:t>1183.0</w:t>
-            </w:r>
-          </w:p>
-        </w:tc>
-        <w:tc>
-          <w:tcPr>
-            <w:tcW w:type="dxa" w:w="785"/>
-          </w:tcPr>
-          <w:p>
-            <w:r>
-              <w:t>38.0</w:t>
-            </w:r>
-          </w:p>
-        </w:tc>
-        <w:tc>
-          <w:tcPr>
-            <w:tcW w:type="dxa" w:w="785"/>
-          </w:tcPr>
-          <w:p>
-            <w:r>
-              <w:t>289.0</w:t>
-            </w:r>
-          </w:p>
-        </w:tc>
-        <w:tc>
-          <w:tcPr>
-            <w:tcW w:type="dxa" w:w="785"/>
-          </w:tcPr>
-          <w:p>
-            <w:r>
-              <w:t>0.501</w:t>
-            </w:r>
-          </w:p>
-        </w:tc>
-        <w:tc>
-          <w:tcPr>
-            <w:tcW w:type="dxa" w:w="785"/>
-          </w:tcPr>
-          <w:p>
-            <w:r>
-              <w:t>0.969</w:t>
-            </w:r>
-          </w:p>
-        </w:tc>
-        <w:tc>
-          <w:tcPr>
-            <w:tcW w:type="dxa" w:w="785"/>
-          </w:tcPr>
-          <w:p>
-            <w:r>
-              <w:t>0.884</w:t>
-            </w:r>
-          </w:p>
-        </w:tc>
-        <w:tc>
-          <w:tcPr>
-            <w:tcW w:type="dxa" w:w="785"/>
-          </w:tcPr>
-          <w:p>
-            <w:r>
-              <w:t>0.804</w:t>
-            </w:r>
-          </w:p>
-        </w:tc>
-        <w:tc>
-          <w:tcPr>
-            <w:tcW w:type="dxa" w:w="785"/>
-          </w:tcPr>
-          <w:p>
-            <w:r>
-              <w:t>0.639</w:t>
-            </w:r>
-          </w:p>
-        </w:tc>
-        <w:tc>
-          <w:tcPr>
-            <w:tcW w:type="dxa" w:w="785"/>
-          </w:tcPr>
-          <w:p>
-            <w:r>
-              <w:t>0.818</w:t>
-            </w:r>
-          </w:p>
-        </w:tc>
-      </w:tr>
-      <w:tr>
-        <w:tc>
-          <w:tcPr>
-            <w:tcW w:type="dxa" w:w="785"/>
-          </w:tcPr>
-          <w:p>
-            <w:r>
               <w:t>0.8</w:t>
             </w:r>
           </w:p>
@@ -2249,7 +2382,7 @@
           </w:tcPr>
           <w:p>
             <w:r>
-              <w:t>224.0</w:t>
+              <w:t>209.0</w:t>
             </w:r>
           </w:p>
         </w:tc>
@@ -2259,7 +2392,7 @@
           </w:tcPr>
           <w:p>
             <w:r>
-              <w:t>1204.0</w:t>
+              <w:t>1206.0</w:t>
             </w:r>
           </w:p>
         </w:tc>
@@ -2269,7 +2402,7 @@
           </w:tcPr>
           <w:p>
             <w:r>
-              <w:t>17.0</w:t>
+              <w:t>15.0</w:t>
             </w:r>
           </w:p>
         </w:tc>
@@ -2279,7 +2412,7 @@
           </w:tcPr>
           <w:p>
             <w:r>
-              <w:t>355.0</w:t>
+              <w:t>370.0</w:t>
             </w:r>
           </w:p>
         </w:tc>
@@ -2289,7 +2422,7 @@
           </w:tcPr>
           <w:p>
             <w:r>
-              <w:t>0.387</w:t>
+              <w:t>0.361</w:t>
             </w:r>
           </w:p>
         </w:tc>
@@ -2299,7 +2432,7 @@
           </w:tcPr>
           <w:p>
             <w:r>
-              <w:t>0.986</w:t>
+              <w:t>0.988</w:t>
             </w:r>
           </w:p>
         </w:tc>
@@ -2309,7 +2442,7 @@
           </w:tcPr>
           <w:p>
             <w:r>
-              <w:t>0.929</w:t>
+              <w:t>0.933</w:t>
             </w:r>
           </w:p>
         </w:tc>
@@ -2319,7 +2452,7 @@
           </w:tcPr>
           <w:p>
             <w:r>
-              <w:t>0.772</w:t>
+              <w:t>0.765</w:t>
             </w:r>
           </w:p>
         </w:tc>
@@ -2329,7 +2462,7 @@
           </w:tcPr>
           <w:p>
             <w:r>
-              <w:t>0.546</w:t>
+              <w:t>0.521</w:t>
             </w:r>
           </w:p>
         </w:tc>
@@ -2339,7 +2472,7 @@
           </w:tcPr>
           <w:p>
             <w:r>
-              <w:t>0.793</w:t>
+              <w:t>0.786</w:t>
             </w:r>
           </w:p>
         </w:tc>
@@ -2361,7 +2494,7 @@
           </w:tcPr>
           <w:p>
             <w:r>
-              <w:t>136.0</w:t>
+              <w:t>114.0</w:t>
             </w:r>
           </w:p>
         </w:tc>
@@ -2371,7 +2504,7 @@
           </w:tcPr>
           <w:p>
             <w:r>
-              <w:t>1217.0</w:t>
+              <w:t>1218.0</w:t>
             </w:r>
           </w:p>
         </w:tc>
@@ -2381,7 +2514,7 @@
           </w:tcPr>
           <w:p>
             <w:r>
-              <w:t>4.0</w:t>
+              <w:t>3.0</w:t>
             </w:r>
           </w:p>
         </w:tc>
@@ -2391,7 +2524,7 @@
           </w:tcPr>
           <w:p>
             <w:r>
-              <w:t>443.0</w:t>
+              <w:t>465.0</w:t>
             </w:r>
           </w:p>
         </w:tc>
@@ -2401,7 +2534,7 @@
           </w:tcPr>
           <w:p>
             <w:r>
-              <w:t>0.235</w:t>
+              <w:t>0.197</w:t>
             </w:r>
           </w:p>
         </w:tc>
@@ -2411,7 +2544,7 @@
           </w:tcPr>
           <w:p>
             <w:r>
-              <w:t>0.997</w:t>
+              <w:t>0.998</w:t>
             </w:r>
           </w:p>
         </w:tc>
@@ -2421,7 +2554,7 @@
           </w:tcPr>
           <w:p>
             <w:r>
-              <w:t>0.971</w:t>
+              <w:t>0.974</w:t>
             </w:r>
           </w:p>
         </w:tc>
@@ -2431,7 +2564,7 @@
           </w:tcPr>
           <w:p>
             <w:r>
-              <w:t>0.733</w:t>
+              <w:t>0.724</w:t>
             </w:r>
           </w:p>
         </w:tc>
@@ -2441,7 +2574,7 @@
           </w:tcPr>
           <w:p>
             <w:r>
-              <w:t>0.378</w:t>
+              <w:t>0.328</w:t>
             </w:r>
           </w:p>
         </w:tc>
@@ -2451,7 +2584,7 @@
           </w:tcPr>
           <w:p>
             <w:r>
-              <w:t>0.752</w:t>
+              <w:t>0.74</w:t>
             </w:r>
           </w:p>
         </w:tc>

</xml_diff>